<commit_message>
docs: add technical architecture documentation for Centriq system
</commit_message>
<xml_diff>
--- a/docs/Centriq Technical Architecture Document.docx
+++ b/docs/Centriq Technical Architecture Document.docx
@@ -7710,6 +7710,20 @@
     </w:p>
     <w:p>
       <w:pPr>
+        <w:pStyle w:val="ListBullet"/>
+      </w:pPr>
+      <w:r>
+        <w:rPr>
+          <w:b/>
+        </w:rPr>
+        <w:t xml:space="preserve">Lineage – </w:t>
+      </w:r>
+      <w:r>
+        <w:t>each profile also records a lineage summary and links to related projects and reference documents, connecting a project to its predecessors, forks, and shared source material.</w:t>
+      </w:r>
+    </w:p>
+    <w:p>
+      <w:pPr>
         <w:pStyle w:val="Heading2"/>
       </w:pPr>
       <w:bookmarkStart w:id="29" w:name="_Toc233915390"/>
@@ -7727,6 +7741,9 @@
       </w:r>
       <w:r>
         <w:t xml:space="preserve"> both as a PMO console and as natural-language tools inside the assistant, with expert results linked to people, allocations, and skills so the right person can be found — not just the right document.</w:t>
+      </w:r>
+      <w:r>
+        <w:t xml:space="preserve"> Lineage links also power multi-hop lineage queries that traverse related projects to synthesize a single cross-project answer (agentic DNA search).</w:t>
       </w:r>
     </w:p>
     <w:p>

</xml_diff>

<commit_message>
feat: implement eSSL attendance service and integrate portal management system infrastructure
</commit_message>
<xml_diff>
--- a/docs/Centriq Technical Architecture Document.docx
+++ b/docs/Centriq Technical Architecture Document.docx
@@ -43,21 +43,6 @@
         <w:t>Intelligent Workplace Concierge for HR · IT · Admin · PMO</w:t>
       </w:r>
     </w:p>
-    <w:p/>
-    <w:p/>
-    <w:p>
-      <w:pPr>
-        <w:jc w:val="center"/>
-      </w:pPr>
-      <w:r>
-        <w:rPr>
-          <w:color w:val="C7D2E0"/>
-          <w:sz w:val="20"/>
-        </w:rPr>
-        <w:t xml:space="preserve">— — — — — — — — — — — — — — — — — — — — </w:t>
-      </w:r>
-    </w:p>
-    <w:p/>
     <w:tbl>
       <w:tblPr>
         <w:tblW w:w="0" w:type="auto"/>
@@ -6533,14 +6518,8 @@
             <w:tcW w:w="1791" w:type="dxa"/>
           </w:tcPr>
           <w:p>
-            <w:pPr>
-              <w:spacing w:before="20" w:after="20"/>
-            </w:pPr>
             <w:r>
-              <w:rPr>
-                <w:sz w:val="19"/>
-              </w:rPr>
-              <w:t>Read / Write</w:t>
+              <w:t>Read / Write (pending Zoho API access)</w:t>
             </w:r>
           </w:p>
         </w:tc>
@@ -6753,14 +6732,8 @@
             <w:shd w:val="clear" w:color="auto" w:fill="EEF4FB"/>
           </w:tcPr>
           <w:p>
-            <w:pPr>
-              <w:spacing w:before="20" w:after="20"/>
-            </w:pPr>
             <w:r>
-              <w:rPr>
-                <w:sz w:val="19"/>
-              </w:rPr>
-              <w:t>Read</w:t>
+              <w:t>Read / Write</w:t>
             </w:r>
           </w:p>
         </w:tc>
@@ -6823,21 +6796,12 @@
             <w:tcW w:w="1791" w:type="dxa"/>
           </w:tcPr>
           <w:p>
-            <w:pPr>
-              <w:spacing w:before="20" w:after="20"/>
-            </w:pPr>
             <w:r>
-              <w:rPr>
-                <w:sz w:val="19"/>
-              </w:rPr>
-              <w:t xml:space="preserve">Read + </w:t>
+              <w:t xml:space="preserve">Read (write via </w:t>
             </w:r>
             <w:r>
-              <w:rPr>
-                <w:sz w:val="19"/>
-              </w:rPr>
               <w:lastRenderedPageBreak/>
-              <w:t>provisioning</w:t>
+              <w:t>SCIM, pending access)</w:t>
             </w:r>
           </w:p>
         </w:tc>
@@ -6846,22 +6810,13 @@
             <w:tcW w:w="4205" w:type="dxa"/>
           </w:tcPr>
           <w:p>
-            <w:pPr>
-              <w:spacing w:before="20" w:after="20"/>
-            </w:pPr>
             <w:r>
-              <w:rPr>
-                <w:sz w:val="19"/>
-              </w:rPr>
               <w:lastRenderedPageBreak/>
-              <w:t xml:space="preserve">Course catalog search, seat/license requests, </w:t>
+              <w:t xml:space="preserve">Course catalog search, seat/license </w:t>
             </w:r>
             <w:r>
-              <w:rPr>
-                <w:sz w:val="19"/>
-              </w:rPr>
               <w:lastRenderedPageBreak/>
-              <w:t>inactive-seat reclamation</w:t>
+              <w:t>requests, inactive-seat reclamation; SCIM-ready user &amp; license-pool provisioning (dormant pending Azure AD SCIM credentials)</w:t>
             </w:r>
           </w:p>
         </w:tc>
@@ -6911,14 +6866,8 @@
             <w:shd w:val="clear" w:color="auto" w:fill="EEF4FB"/>
           </w:tcPr>
           <w:p>
-            <w:pPr>
-              <w:spacing w:before="20" w:after="20"/>
-            </w:pPr>
             <w:r>
-              <w:rPr>
-                <w:sz w:val="19"/>
-              </w:rPr>
-              <w:t>Read / Write</w:t>
+              <w:t>Read / Write (in-house LMS; pending TechElevate API access)</w:t>
             </w:r>
           </w:p>
         </w:tc>
@@ -6993,14 +6942,8 @@
             <w:tcW w:w="1791" w:type="dxa"/>
           </w:tcPr>
           <w:p>
-            <w:pPr>
-              <w:spacing w:before="20" w:after="20"/>
-            </w:pPr>
             <w:r>
-              <w:rPr>
-                <w:sz w:val="19"/>
-              </w:rPr>
-              <w:t>Read / Write</w:t>
+              <w:t>Read / Write (currently against a mock endpoint, pending real ManageEngine credentials)</w:t>
             </w:r>
           </w:p>
         </w:tc>
@@ -7017,6 +6960,51 @@
                 <w:sz w:val="19"/>
               </w:rPr>
               <w:t>IT ticket and asset operations</w:t>
+            </w:r>
+          </w:p>
+        </w:tc>
+      </w:tr>
+      <w:tr>
+        <w:trPr>
+          <w:jc w:val="center"/>
+        </w:trPr>
+        <w:tc>
+          <w:tcPr>
+            <w:tcW w:w="2218" w:type="dxa"/>
+          </w:tcPr>
+          <w:p>
+            <w:r>
+              <w:t>Admin Portals</w:t>
+            </w:r>
+          </w:p>
+        </w:tc>
+        <w:tc>
+          <w:tcPr>
+            <w:tcW w:w="1650" w:type="dxa"/>
+          </w:tcPr>
+          <w:p>
+            <w:r>
+              <w:t>Facilities &amp; workplace services</w:t>
+            </w:r>
+          </w:p>
+        </w:tc>
+        <w:tc>
+          <w:tcPr>
+            <w:tcW w:w="1791" w:type="dxa"/>
+          </w:tcPr>
+          <w:p>
+            <w:r>
+              <w:t>Mock (local DB only, no external API connected yet); pending Admin Portal API access</w:t>
+            </w:r>
+          </w:p>
+        </w:tc>
+        <w:tc>
+          <w:tcPr>
+            <w:tcW w:w="4205" w:type="dxa"/>
+          </w:tcPr>
+          <w:p>
+            <w:r>
+              <w:t>Facility complaints, food complaints, parking sticker requests, desk-key and similar workplace-service requests</w:t>
             </w:r>
           </w:p>
         </w:tc>
@@ -7185,6 +7173,34 @@
     </w:p>
     <w:p>
       <w:pPr>
+        <w:rPr>
+          <w:i/>
+          <w:iCs/>
+          <w:sz w:val="19"/>
+          <w:szCs w:val="19"/>
+        </w:rPr>
+      </w:pPr>
+      <w:r>
+        <w:rPr>
+          <w:i/>
+          <w:iCs/>
+          <w:sz w:val="19"/>
+          <w:szCs w:val="19"/>
+        </w:rPr>
+        <w:t>For Udemy Business specifically, SCIM provisioning (built, currently dormant) covers the full lifecycle: provisioning new learners, deactivating and reactivating seats, updating user profile details, managing learning groups (create, rename, delete, move members), and assigning or reclaiming license-pool and Pro-tier licenses — all as role-gated, audited actions callable by PMO</w:t>
+      </w:r>
+      <w:r>
+        <w:rPr>
+          <w:i/>
+          <w:iCs/>
+          <w:sz w:val="19"/>
+          <w:szCs w:val="19"/>
+        </w:rPr>
+        <w:t>. It goes live once an Azure AD SCIM application is provisioned for Udemy and its base URL and token are supplied; until then, the same seat-hygiene insights (e.g. idle-seat lists) are surfaced with a manual deep-link into the Udemy admin console instead of an in-app action.</w:t>
+      </w:r>
+    </w:p>
+    <w:p>
+      <w:pPr>
         <w:pStyle w:val="Heading1"/>
       </w:pPr>
       <w:bookmarkStart w:id="20" w:name="_Toc233915381"/>
@@ -7210,6 +7226,7 @@
       </w:pPr>
       <w:bookmarkStart w:id="21" w:name="_Toc233915382"/>
       <w:r>
+        <w:lastRenderedPageBreak/>
         <w:t>9.1 Connector Studio</w:t>
       </w:r>
       <w:bookmarkEnd w:id="21"/>
@@ -7305,7 +7322,6 @@
       </w:pPr>
       <w:bookmarkStart w:id="24" w:name="_Toc233915385"/>
       <w:r>
-        <w:lastRenderedPageBreak/>
         <w:t>9.4 Analytics &amp; Chart Builder</w:t>
       </w:r>
       <w:bookmarkEnd w:id="24"/>
@@ -7415,6 +7431,7 @@
               <w:rPr>
                 <w:sz w:val="19"/>
               </w:rPr>
+              <w:lastRenderedPageBreak/>
               <w:t>Automation Hub</w:t>
             </w:r>
           </w:p>
@@ -7594,7 +7611,6 @@
         <w:rPr>
           <w:noProof/>
         </w:rPr>
-        <w:lastRenderedPageBreak/>
         <w:drawing>
           <wp:inline distT="0" distB="0" distL="0" distR="0" wp14:anchorId="09DB6A30" wp14:editId="4185615E">
             <wp:extent cx="5943600" cy="3791607"/>
@@ -7686,6 +7702,7 @@
         <w:rPr>
           <w:b/>
         </w:rPr>
+        <w:lastRenderedPageBreak/>
         <w:t xml:space="preserve">DNA extraction — </w:t>
       </w:r>
       <w:r>
@@ -7754,10 +7771,7 @@
         <w:t>surfaces</w:t>
       </w:r>
       <w:r>
-        <w:t xml:space="preserve"> both as a PMO console and as natural-language tools inside the assistant, with expert results linked to people, allocations, and skills so the right person can be found — not just the right document.</w:t>
-      </w:r>
-      <w:r>
-        <w:t xml:space="preserve"> Lineage links also power multi-hop lineage queries that traverse related projects to synthesize a single cross-project answer (agentic DNA search).</w:t>
+        <w:t xml:space="preserve"> both as a PMO console and as natural-language tools inside the assistant, with expert results linked to people, allocations, and skills so the right person can be found — not just the right document. Lineage links also power multi-hop lineage queries that traverse related projects to synthesize a single cross-project answer (agentic DNA search).</w:t>
       </w:r>
     </w:p>
     <w:p>
@@ -7772,11 +7786,7 @@
     </w:p>
     <w:p>
       <w:r>
-        <w:t xml:space="preserve">Beyond delivery knowledge, Centriq closes the loop between the skills the organisation has, the work it needs to staff, and the learning that bridges the two. These capabilities draw on the skills portal, </w:t>
-      </w:r>
-      <w:r>
-        <w:lastRenderedPageBreak/>
-        <w:t>allocation data, and the learning catalogues, and surface both as PMO dashboards and as natural-language tools inside the assistant.</w:t>
+        <w:t>Beyond delivery knowledge, Centriq closes the loop between the skills the organisation has, the work it needs to staff, and the learning that bridges the two. These capabilities draw on the skills portal, allocation data, and the learning catalogues, and surface both as PMO dashboards and as natural-language tools inside the assistant.</w:t>
       </w:r>
     </w:p>
     <w:p>
@@ -7830,6 +7840,7 @@
       </w:pPr>
       <w:bookmarkStart w:id="34" w:name="_Toc233915395"/>
       <w:r>
+        <w:lastRenderedPageBreak/>
         <w:t>12. Data &amp; Persistence</w:t>
       </w:r>
       <w:bookmarkEnd w:id="34"/>
@@ -8253,7 +8264,6 @@
         <w:rPr>
           <w:b/>
         </w:rPr>
-        <w:lastRenderedPageBreak/>
         <w:t xml:space="preserve">Single sign-on — </w:t>
       </w:r>
       <w:r>
@@ -8349,7 +8359,11 @@
         <w:t>storage,</w:t>
       </w:r>
       <w:r>
-        <w:t xml:space="preserve"> so they persist across redeployments. A public entry point fronts the deployment and forwards traffic to the web/proxy service.</w:t>
+        <w:t xml:space="preserve"> so </w:t>
+      </w:r>
+      <w:r>
+        <w:lastRenderedPageBreak/>
+        <w:t>they persist across redeployments. A public entry point fronts the deployment and forwards traffic to the web/proxy service.</w:t>
       </w:r>
     </w:p>
     <w:p>
@@ -8425,7 +8439,6 @@
       </w:pPr>
       <w:bookmarkStart w:id="42" w:name="_Toc233915403"/>
       <w:r>
-        <w:lastRenderedPageBreak/>
         <w:t>15.4 Observability &amp; adoption</w:t>
       </w:r>
       <w:bookmarkEnd w:id="42"/>
@@ -8463,6 +8476,7 @@
         <w:rPr>
           <w:noProof/>
         </w:rPr>
+        <w:lastRenderedPageBreak/>
         <w:drawing>
           <wp:inline distT="0" distB="0" distL="0" distR="0" wp14:anchorId="3DDB881D" wp14:editId="2A018911">
             <wp:extent cx="5760720" cy="2979683"/>
@@ -8748,7 +8762,6 @@
           <w:color w:val="64748B"/>
           <w:sz w:val="18"/>
         </w:rPr>
-        <w:lastRenderedPageBreak/>
         <w:t>Model tiers, routing thresholds, and integration activation are configurable at runtime and may differ from the defaults shown here.</w:t>
       </w:r>
     </w:p>

</xml_diff>